<commit_message>
V9 Html No colapsaba
</commit_message>
<xml_diff>
--- a/MesaDeTrabajo_Documentacion_v9.docx
+++ b/MesaDeTrabajo_Documentacion_v9.docx
@@ -8257,12 +8257,13 @@
                 <w:szCs w:val="20"/>
               </w:rPr>
             </w:pPr>
+            <w:bookmarkStart w:id="0" w:name="_GoBack"/>
             <w:r>
               <w:rPr>
                 <w:rFonts w:ascii="Arial" w:hAnsi="Arial" w:cs="Arial"/>
                 <w:sz w:val="20"/>
               </w:rPr>
-              <w:t xml:space="preserve">- Notas largas en panel derecho ahora se muestran contraídas (~4 líneas) con botón "Ver más / Ver menos" - Notas cortas no muestran botón (sin cambio visual) - Animación suave de expansión/colapso con degradado de corte - El ícono </w:t>
+              <w:t xml:space="preserve">- Notas largas en panel derecho se muestran contraídas (~4 líneas) con botón "Ver más / Ver menos" - Notas cortas no muestran botón (sin cambio visual) - Animación suave de expansión/colapso con gradiente de corte al pie - El ícono </w:t>
             </w:r>
             <w:proofErr w:type="spellStart"/>
             <w:r>
@@ -8278,7 +8279,7 @@
                 <w:rFonts w:ascii="Arial" w:hAnsi="Arial" w:cs="Arial"/>
                 <w:sz w:val="20"/>
               </w:rPr>
-              <w:t xml:space="preserve"> rota al expandir para indicar el estado - Al colapsar, </w:t>
+              <w:t xml:space="preserve"> rota 180° al expandir para indicar estado - Al colapsar, </w:t>
             </w:r>
             <w:proofErr w:type="spellStart"/>
             <w:r>
@@ -8310,8 +8311,57 @@
                 <w:rFonts w:ascii="Arial" w:hAnsi="Arial" w:cs="Arial"/>
                 <w:sz w:val="20"/>
               </w:rPr>
-              <w:t xml:space="preserve"> para no perder contexto - Sin cambios en GAS (mesa_v7.gs se mantiene igual)</w:t>
-            </w:r>
+              <w:t xml:space="preserve"> para no perder el contexto - </w:t>
+            </w:r>
+            <w:proofErr w:type="spellStart"/>
+            <w:r>
+              <w:rPr>
+                <w:rFonts w:ascii="Arial" w:hAnsi="Arial" w:cs="Arial"/>
+                <w:sz w:val="20"/>
+              </w:rPr>
+              <w:t>Fix</w:t>
+            </w:r>
+            <w:proofErr w:type="spellEnd"/>
+            <w:r>
+              <w:rPr>
+                <w:rFonts w:ascii="Arial" w:hAnsi="Arial" w:cs="Arial"/>
+                <w:sz w:val="20"/>
+              </w:rPr>
+              <w:t xml:space="preserve">: versión v9 ahora aparece correctamente en </w:t>
+            </w:r>
+            <w:proofErr w:type="spellStart"/>
+            <w:r>
+              <w:rPr>
+                <w:rFonts w:ascii="Arial" w:hAnsi="Arial" w:cs="Arial"/>
+                <w:sz w:val="20"/>
+              </w:rPr>
+              <w:t>header</w:t>
+            </w:r>
+            <w:proofErr w:type="spellEnd"/>
+            <w:r>
+              <w:rPr>
+                <w:rFonts w:ascii="Arial" w:hAnsi="Arial" w:cs="Arial"/>
+                <w:sz w:val="20"/>
+              </w:rPr>
+              <w:t xml:space="preserve"> y pantalla de </w:t>
+            </w:r>
+            <w:proofErr w:type="spellStart"/>
+            <w:r>
+              <w:rPr>
+                <w:rFonts w:ascii="Arial" w:hAnsi="Arial" w:cs="Arial"/>
+                <w:sz w:val="20"/>
+              </w:rPr>
+              <w:t>login</w:t>
+            </w:r>
+            <w:proofErr w:type="spellEnd"/>
+            <w:r>
+              <w:rPr>
+                <w:rFonts w:ascii="Arial" w:hAnsi="Arial" w:cs="Arial"/>
+                <w:sz w:val="20"/>
+              </w:rPr>
+              <w:t xml:space="preserve"> - Sin cambios en GAS (mesa_v7.gs se mantiene igual)</w:t>
+            </w:r>
+            <w:bookmarkEnd w:id="0"/>
           </w:p>
         </w:tc>
       </w:tr>
@@ -12485,8 +12535,6 @@
               </w:rPr>
               <w:t>9</w:t>
             </w:r>
-            <w:bookmarkStart w:id="0" w:name="_GoBack"/>
-            <w:bookmarkEnd w:id="0"/>
             <w:r>
               <w:rPr>
                 <w:color w:val="1E293B"/>

</xml_diff>